<commit_message>
[pncs-systematic] Final Word doc (R4) — 47KB, 4,387词
</commit_message>
<xml_diff>
--- a/manuscript/PNCS_Systematic_Review.docx
+++ b/manuscript/PNCS_Systematic_Review.docx
@@ -348,7 +348,7 @@
           <w:i w:val="0"/>
           <w:sz w:val="24"/>
         </w:rPr>
-        <w:t>Bronchopulmonary dysplasia (BPD) affects approximately 40% of infants born before 28 weeks' gestation [1] and is independently associated with cerebral palsy, cognitive delay, and reduced quality of life [2]. Among pharmacological strategies to prevent BPD, systemic postnatal corticosteroids occupy a uniquely contentious position: they are among the most effective interventions for reducing BPD, and simultaneously among the most feared for their potential to harm the developing brain.</w:t>
+        <w:t>Bronchopulmonary dysplasia (BPD) affects approximately 40% of infants born before 28 weeks' gestation [1] and is independently associated with cerebral palsy, cognitive delay, and reduced quality of life [2]. Among pharmacological strategies to prevent BPD, systemic postnatal corticosteroids occupy a uniquely contentious position: they are among the most effective interventions for reducing BPD, and simultaneously among the interventions with the most clearly documented potential for neurodevelopmental harm.</w:t>
       </w:r>
     </w:p>
     <w:p>
@@ -1281,7 +1281,7 @@
                 <w:i w:val="0"/>
                 <w:sz w:val="20"/>
               </w:rPr>
-              <w:t>Mortality reduction; HC school-age safety emerging [15, 33, 36]</w:t>
+              <w:t>Mortality reduction; HC school-age data emerging [15, 33, 36]</w:t>
             </w:r>
           </w:p>
         </w:tc>

</xml_diff>